<commit_message>
Update resume and portfolio details
</commit_message>
<xml_diff>
--- a/resume/Kristine-Joy-Torres-Resume.docx
+++ b/resume/Kristine-Joy-Torres-Resume.docx
@@ -28,7 +28,7 @@
           <w:color w:val="095B5D"/>
           <w:sz w:val="16"/>
         </w:rPr>
-        <w:t>INFORMATION TECHNOLOGY STUDENT  •  SOFTWARE DEVELOPMENT &amp; NETWORK ADMINISTRATION</w:t>
+        <w:t>INFORMATION TECHNOLOGY STUDENT  •  SOFTWARE, NETWORKING &amp; CREATIVE TECHNOLOGY</w:t>
       </w:r>
     </w:p>
     <w:p>
@@ -102,7 +102,7 @@
         <w:spacing w:after="40"/>
       </w:pPr>
       <w:r>
-        <w:t>Third-year Bachelor of Science in Information Technology student at the Polytechnic University of the Philippines with hands-on academic experience in Java and MySQL application development, responsive web technologies, and Cisco Packet Tracer network configuration. Collaborative team member with experience in project documentation, troubleshooting, and technical problem-solving. Interested in internship opportunities in software development, IT support, or network administration.</w:t>
+        <w:t>Third-year Bachelor of Science in Information Technology student at the Polytechnic University of the Philippines with academic experience in Java/MySQL development, Cisco Packet Tracer network administration, and Figma UI/UX prototyping. Collaborative team member and student leader with an interest in multimedia editing and digital design, seeking opportunities to apply and strengthen technical and creative skills.</w:t>
       </w:r>
     </w:p>
     <w:p>
@@ -210,16 +210,31 @@
       <w:r>
         <w:rPr>
           <w:b/>
-          <w:color w:val="1F333B"/>
-          <w:sz w:val="18"/>
         </w:rPr>
-        <w:t xml:space="preserve">Development &amp; Design Tools:  </w:t>
+        <w:t xml:space="preserve">Development Tools:  </w:t>
       </w:r>
       <w:r>
         <w:rPr>
-          <w:sz w:val="18"/>
+          <w:b w:val="0"/>
         </w:rPr>
-        <w:t>VS Code, Eclipse IDE, XAMPP, Git/GitHub, Figma, Canva</w:t>
+        <w:t>Visual Studio Code, Eclipse IDE, XAMPP, Git/GitHub</w:t>
+      </w:r>
+    </w:p>
+    <w:p>
+      <w:pPr>
+        <w:spacing w:after="20"/>
+      </w:pPr>
+      <w:r>
+        <w:rPr>
+          <w:b/>
+        </w:rPr>
+        <w:t xml:space="preserve">UI/UX &amp; Multimedia:  </w:t>
+      </w:r>
+      <w:r>
+        <w:rPr>
+          <w:b w:val="0"/>
+        </w:rPr>
+        <w:t>Figma, Canva, CapCut; basic familiarity with Adobe creative software</w:t>
       </w:r>
     </w:p>
     <w:p>
@@ -236,7 +251,7 @@
     <w:p>
       <w:pPr>
         <w:pStyle w:val="JobTitle"/>
-        <w:spacing w:before="80"/>
+        <w:spacing w:before="40"/>
       </w:pPr>
       <w:r>
         <w:rPr>
@@ -256,7 +271,7 @@
     <w:p>
       <w:pPr>
         <w:pStyle w:val="RegularSmall"/>
-        <w:spacing w:after="40"/>
+        <w:spacing w:after="20"/>
         <w:ind w:left="187"/>
       </w:pPr>
       <w:r>
@@ -266,7 +281,7 @@
     <w:p>
       <w:pPr>
         <w:pStyle w:val="JobTitle"/>
-        <w:spacing w:before="80"/>
+        <w:spacing w:before="40"/>
       </w:pPr>
       <w:r>
         <w:rPr>
@@ -286,7 +301,7 @@
     <w:p>
       <w:pPr>
         <w:pStyle w:val="RegularSmall"/>
-        <w:spacing w:after="40"/>
+        <w:spacing w:after="20"/>
         <w:ind w:left="187"/>
       </w:pPr>
       <w:r>
@@ -296,7 +311,7 @@
     <w:p>
       <w:pPr>
         <w:pStyle w:val="JobTitle"/>
-        <w:spacing w:before="80"/>
+        <w:spacing w:before="40"/>
       </w:pPr>
       <w:r>
         <w:rPr>
@@ -316,7 +331,7 @@
     <w:p>
       <w:pPr>
         <w:pStyle w:val="RegularSmall"/>
-        <w:spacing w:after="40"/>
+        <w:spacing w:after="20"/>
         <w:ind w:left="187"/>
       </w:pPr>
       <w:r>
@@ -326,7 +341,7 @@
     <w:p>
       <w:pPr>
         <w:pStyle w:val="JobTitle"/>
-        <w:spacing w:before="80"/>
+        <w:spacing w:before="40"/>
       </w:pPr>
       <w:r>
         <w:rPr>
@@ -346,7 +361,7 @@
     <w:p>
       <w:pPr>
         <w:pStyle w:val="RegularSmall"/>
-        <w:spacing w:after="40"/>
+        <w:spacing w:after="20"/>
         <w:ind w:left="187"/>
       </w:pPr>
       <w:r>
@@ -356,7 +371,7 @@
     <w:p>
       <w:pPr>
         <w:pStyle w:val="JobTitle"/>
-        <w:spacing w:before="80"/>
+        <w:spacing w:before="40"/>
       </w:pPr>
       <w:r>
         <w:rPr>
@@ -376,11 +391,38 @@
     <w:p>
       <w:pPr>
         <w:pStyle w:val="RegularSmall"/>
-        <w:spacing w:after="40"/>
+        <w:spacing w:after="20"/>
         <w:ind w:left="187"/>
       </w:pPr>
       <w:r>
         <w:t>Explored an offline-first study companion for organizing learning materials, notes, and academic tasks, including early-stage local AI functionality.</w:t>
+      </w:r>
+    </w:p>
+    <w:p>
+      <w:pPr>
+        <w:pStyle w:val="JobTitle"/>
+        <w:spacing w:before="40"/>
+      </w:pPr>
+      <w:r>
+        <w:rPr>
+          <w:b/>
+        </w:rPr>
+        <w:t>PUPulot — PUP Lost &amp; Found Application</w:t>
+      </w:r>
+      <w:r>
+        <w:rPr>
+          <w:b w:val="0"/>
+        </w:rPr>
+        <w:t xml:space="preserve">  |  Collaborative Figma UI/UX Prototype</w:t>
+      </w:r>
+    </w:p>
+    <w:p>
+      <w:pPr>
+        <w:pStyle w:val="RegularSmall"/>
+        <w:spacing w:after="20"/>
+      </w:pPr>
+      <w:r>
+        <w:t>Collaborated on interface design and interactive prototyping for a campus lost-and-found concept, including screen layouts, user navigation, and visual design in Figma.</w:t>
       </w:r>
     </w:p>
     <w:p>
@@ -435,15 +477,58 @@
     </w:p>
     <w:p>
       <w:pPr>
+        <w:spacing w:after="20"/>
+      </w:pPr>
+      <w:r>
+        <w:rPr>
+          <w:b/>
+        </w:rPr>
+        <w:t xml:space="preserve">Class Representative — BSIT 3-2 (Web Development):  </w:t>
+      </w:r>
+      <w:r>
+        <w:rPr>
+          <w:b w:val="0"/>
+        </w:rPr>
+        <w:t>Coordinated announcements, deadlines, learning arrangements, and communication between instructor and classmates.</w:t>
+      </w:r>
+    </w:p>
+    <w:p>
+      <w:pPr>
+        <w:spacing w:after="20"/>
+      </w:pPr>
+      <w:r>
+        <w:rPr>
+          <w:b/>
+        </w:rPr>
+        <w:t xml:space="preserve">Badminton Team Captain — CCIS:  </w:t>
+      </w:r>
+      <w:r>
+        <w:rPr>
+          <w:b w:val="0"/>
+        </w:rPr>
+        <w:t>Supported teamwork, coordination, and communication among teammates.</w:t>
+      </w:r>
+    </w:p>
+    <w:p>
+      <w:pPr>
         <w:spacing w:after="0"/>
       </w:pPr>
       <w:r>
-        <w:t>Class representative for Web Development (BSIT 3-2), coordinating class updates and communicating with the instructor. Skills include teamwork, communication, organization, adaptability, time management, and problem-solving.</w:t>
+        <w:rPr>
+          <w:b/>
+        </w:rPr>
+        <w:t xml:space="preserve">Strengths:  </w:t>
+      </w:r>
+      <w:r>
+        <w:rPr>
+          <w:b w:val="0"/>
+        </w:rPr>
+        <w:t>Leadership, collaboration, organization, adaptability, time management, problem-solving, and creativity.</w:t>
       </w:r>
     </w:p>
     <w:sectPr>
       <w:pgSz w:w="11909" w:h="16834"/>
-      <w:pgMar w:top="893" w:right="1051" w:bottom="850" w:left="1051" w:header="331" w:footer="317" w:gutter="0"/>
+      <w:pgMar w:top="792" w:right="1051" w:bottom="706" w:left="1051" w:header="331" w:footer="317" w:gutter="0"/>
       <w:cols w:space="720"/>
       <w:docGrid w:linePitch="360"/>
     </w:sectPr>
@@ -815,7 +900,7 @@
     <w:qFormat/>
     <w:rsid w:val="00FC693F"/>
     <w:pPr>
-      <w:spacing w:after="0" w:line="269" w:lineRule="auto"/>
+      <w:spacing w:after="0" w:line="258" w:lineRule="auto"/>
     </w:pPr>
     <w:rPr>
       <w:rFonts w:ascii="Aptos" w:hAnsi="Aptos"/>
@@ -12509,7 +12594,7 @@
     <w:name w:val="SectionHeader"/>
     <w:basedOn w:val="Normal"/>
     <w:pPr>
-      <w:spacing w:before="220" w:after="100"/>
+      <w:spacing w:before="120" w:after="60"/>
     </w:pPr>
     <w:rPr>
       <w:rFonts w:ascii="Aptos" w:hAnsi="Aptos"/>
@@ -12522,7 +12607,7 @@
     <w:name w:val="JobTitle"/>
     <w:basedOn w:val="Normal"/>
     <w:pPr>
-      <w:spacing w:before="0" w:after="0"/>
+      <w:spacing w:before="0" w:after="0" w:line="250" w:lineRule="auto"/>
     </w:pPr>
     <w:rPr>
       <w:rFonts w:ascii="Aptos" w:hAnsi="Aptos"/>
@@ -12535,7 +12620,7 @@
     <w:name w:val="RegularSmall"/>
     <w:basedOn w:val="Normal"/>
     <w:pPr>
-      <w:spacing w:before="0" w:after="0"/>
+      <w:spacing w:before="0" w:after="0" w:line="250" w:lineRule="auto"/>
     </w:pPr>
     <w:rPr>
       <w:rFonts w:ascii="Aptos" w:hAnsi="Aptos"/>

</xml_diff>